<commit_message>
Updates to include workflow for "Next challenger" sections in answers.
</commit_message>
<xml_diff>
--- a/Workshops/Workshop 2 - Data vis/W2.docx
+++ b/Workshops/Workshop 2 - Data vis/W2.docx
@@ -19,19 +19,19 @@
         <w:t xml:space="preserve"> </w:t>
       </w:r>
       <w:r>
-        <w:t xml:space="preserve">1.1:</w:t>
-      </w:r>
-      <w:r>
-        <w:t xml:space="preserve"> </w:t>
-      </w:r>
-      <w:r>
-        <w:t xml:space="preserve">Hidden</w:t>
-      </w:r>
-      <w:r>
-        <w:t xml:space="preserve"> </w:t>
-      </w:r>
-      <w:r>
-        <w:t xml:space="preserve">Assumptions</w:t>
+        <w:t xml:space="preserve">2:</w:t>
+      </w:r>
+      <w:r>
+        <w:t xml:space="preserve"> </w:t>
+      </w:r>
+      <w:r>
+        <w:t xml:space="preserve">Data</w:t>
+      </w:r>
+      <w:r>
+        <w:t xml:space="preserve"> </w:t>
+      </w:r>
+      <w:r>
+        <w:t xml:space="preserve">visualisation</w:t>
       </w:r>
     </w:p>
     <w:p>
@@ -71,7 +71,7 @@
         <w:t xml:space="preserve"> </w:t>
       </w:r>
       <w:r>
-        <w:t xml:space="preserve">2024-08-15</w:t>
+        <w:t xml:space="preserve">2024-09-02</w:t>
       </w:r>
     </w:p>
     <w:sdt>
@@ -111,14 +111,6 @@
     </w:p>
     <w:p>
       <w:pPr>
-        <w:pStyle w:val="FirstParagraph"/>
-      </w:pPr>
-      <w:r>
-        <w:t xml:space="preserve">As always, we are using the workflow below to structure the workshops:</w:t>
-      </w:r>
-    </w:p>
-    <w:p>
-      <w:pPr>
         <w:numPr>
           <w:ilvl w:val="0"/>
           <w:numId w:val="1001"/>
@@ -206,7 +198,7 @@
         <w:pStyle w:val="FirstParagraph"/>
       </w:pPr>
       <w:r>
-        <w:t xml:space="preserve">We covered steps 2 and 3 in the previous workshop but we’ll expand your toolkit for doing so today suing data visualisation.</w:t>
+        <w:t xml:space="preserve">We covered steps 2 and 3 in the previous workshop but we’ll expand your toolkit for doing so today using data visualisation.</w:t>
       </w:r>
     </w:p>
     <w:bookmarkEnd w:id="20"/>
@@ -344,7 +336,7 @@
         <w:t xml:space="preserve"> </w:t>
       </w:r>
       <w:r>
-        <w:t xml:space="preserve">a framework for data visualisation. It allows you to build plots layer by layer, starting with a base plot and then adding additional elements such as scales, themes, and geometries. Familiarity with</w:t>
+        <w:t xml:space="preserve">a framework for data visualisation. It allows you to build plots layer by layer, starting with a base plot and then adding additional elements such as scales, themes, and geometries. Using this framework, you can create pretty sophisticated figures with surprisingly little effort. It’s such a popular tool that familiarity with</w:t>
       </w:r>
       <w:r>
         <w:t xml:space="preserve"> </w:t>
@@ -359,7 +351,7 @@
         <w:t xml:space="preserve"> </w:t>
       </w:r>
       <w:r>
-        <w:t xml:space="preserve">is occasionally asked for by employers; we’ve even seen job adverts from companies such as Spotify listing this an an essential criteria.</w:t>
+        <w:t xml:space="preserve">is sometimes asked for by employers; we’ve even seen job adverts from companies such as Spotify listing this an an essential criteria.</w:t>
       </w:r>
     </w:p>
     <w:p>
@@ -409,7 +401,7 @@
         <w:t xml:space="preserve"> </w:t>
       </w:r>
       <w:r>
-        <w:t xml:space="preserve">as we feel it is a more intuiative way to create figures; indeed, nearly every single figure you have and will see on this course were produced in</w:t>
+        <w:t xml:space="preserve">as we feel it is a more intuitive way to create figures; indeed, nearly every single figure you have and will see on this course were produced in</w:t>
       </w:r>
       <w:r>
         <w:t xml:space="preserve"> </w:t>
@@ -451,7 +443,7 @@
         <w:t xml:space="preserve"> </w:t>
       </w:r>
       <w:r>
-        <w:t xml:space="preserve">- I wonder if the person who named the species, named them after their friend Geoff…). Specifically, we’re interested here in seeing if there is sexual dimorphism in asymptotic length (i.e. once an animal has stopped growing) between females and males, as well as how the species respond to droughts. As always, before we do any analysis, we need to ensure there is nothing</w:t>
+        <w:t xml:space="preserve">- I wonder if the person who named the species had a friend called Geoff…). For this first interaction with this data we’ll broadly say that we’re interested in seeing if there is sexual dimorphism in asymptotic length (i.e. once an animal has stopped growing) between females and males, as well as how the species respond to droughts. As always, before we do any analysis, we need to ensure there is nothing</w:t>
       </w:r>
       <w:r>
         <w:t xml:space="preserve"> </w:t>
@@ -520,6 +512,33 @@
       <w:pPr>
         <w:pStyle w:val="SourceCode"/>
       </w:pPr>
+      <w:r>
+        <w:rPr>
+          <w:rStyle w:val="FunctionTok"/>
+        </w:rPr>
+        <w:t xml:space="preserve">setwd</w:t>
+      </w:r>
+      <w:r>
+        <w:rPr>
+          <w:rStyle w:val="NormalTok"/>
+        </w:rPr>
+        <w:t xml:space="preserve">(</w:t>
+      </w:r>
+      <w:r>
+        <w:rPr>
+          <w:rStyle w:val="StringTok"/>
+        </w:rPr>
+        <w:t xml:space="preserve">"H:/BI3010/workshop2"</w:t>
+      </w:r>
+      <w:r>
+        <w:rPr>
+          <w:rStyle w:val="NormalTok"/>
+        </w:rPr>
+        <w:t xml:space="preserve">)</w:t>
+      </w:r>
+      <w:r>
+        <w:br/>
+      </w:r>
       <w:r>
         <w:rPr>
           <w:rStyle w:val="NormalTok"/>
@@ -1366,7 +1385,7 @@
         <w:pStyle w:val="BodyText"/>
       </w:pPr>
       <w:r>
-        <w:t xml:space="preserve">Kind of? It’s a bit hard to see the spread of data for each sex. A better way to show this is to use some sort of tool which will show help the reader understand the range of</w:t>
+        <w:t xml:space="preserve">Kind of? It’s a bit hard to see the spread of data for each sex. A better way to show this is to use some sort of tool which will help the reader understand the range of</w:t>
       </w:r>
       <w:r>
         <w:t xml:space="preserve"> </w:t>
@@ -1718,7 +1737,7 @@
         <w:pStyle w:val="BodyText"/>
       </w:pPr>
       <w:r>
-        <w:t xml:space="preserve">Both of these present the same information in different ways. The boxplot uses boxes and lines to indicate the range, the first and third quantiles and the median. Conversely, the violin plot also shows the spread of data but by creating density plots which are mirrored. Boxplots have a long history and use in science, but people are increasingly using violin plots, simply because they’re more transparent than boxplots.</w:t>
+        <w:t xml:space="preserve">Both of these present the same information in different ways. The boxplot uses boxes and lines to indicate the range, the first and third quantiles and the median. Conversely, the violin plot also shows the spread of data but by creating density plots which are mirrored. Boxplots have a long history and use in science, but people are increasingly using violin plots, simply because they’re more transparent and clear than boxplots.</w:t>
       </w:r>
     </w:p>
     <w:p>
@@ -2552,6 +2571,18 @@
         <w:t xml:space="preserve"> drought))</w:t>
       </w:r>
     </w:p>
+    <w:p>
+      <w:pPr>
+        <w:numPr>
+          <w:ilvl w:val="0"/>
+          <w:numId w:val="1007"/>
+        </w:numPr>
+        <w:pStyle w:val="Compact"/>
+      </w:pPr>
+      <w:r>
+        <w:t xml:space="preserve">If I wanted to produce a histogram of boto lengths, what should my code look like?</w:t>
+      </w:r>
+    </w:p>
     <w:bookmarkEnd w:id="47"/>
     <w:bookmarkEnd w:id="48"/>
     <w:bookmarkStart w:id="62" w:name="adding-more-information"/>
@@ -2684,7 +2715,19 @@
         <w:t xml:space="preserve">aes()</w:t>
       </w:r>
       <w:r>
-        <w:t xml:space="preserve">. Remember, anything that we want to change in the figure based on a variable in our dataset, is included via `aes().</w:t>
+        <w:t xml:space="preserve">. Remember, anything that we want to change in the figure based on a variable in our dataset, is included via</w:t>
+      </w:r>
+      <w:r>
+        <w:t xml:space="preserve"> </w:t>
+      </w:r>
+      <w:r>
+        <w:rPr>
+          <w:rStyle w:val="VerbatimChar"/>
+        </w:rPr>
+        <w:t xml:space="preserve">aes()</w:t>
+      </w:r>
+      <w:r>
+        <w:t xml:space="preserve">.</w:t>
       </w:r>
     </w:p>
     <w:p>
@@ -2793,7 +2836,7 @@
               <a:graphicData uri="http://schemas.openxmlformats.org/drawingml/2006/picture">
                 <pic:pic>
                   <pic:nvPicPr>
-                    <pic:cNvPr descr="W2_files/figure-docx/unnamed-chunk-21-1.png" id="51" name="Picture"/>
+                    <pic:cNvPr descr="W2_files/figure-docx/unnamed-chunk-22-1.png" id="51" name="Picture"/>
                     <pic:cNvPicPr>
                       <a:picLocks noChangeArrowheads="1" noChangeAspect="1"/>
                     </pic:cNvPicPr>
@@ -3056,7 +3099,7 @@
               <a:graphicData uri="http://schemas.openxmlformats.org/drawingml/2006/picture">
                 <pic:pic>
                   <pic:nvPicPr>
-                    <pic:cNvPr descr="W2_files/figure-docx/unnamed-chunk-22-1.png" id="54" name="Picture"/>
+                    <pic:cNvPr descr="W2_files/figure-docx/unnamed-chunk-23-1.png" id="54" name="Picture"/>
                     <pic:cNvPicPr>
                       <a:picLocks noChangeArrowheads="1" noChangeAspect="1"/>
                     </pic:cNvPicPr>
@@ -3446,7 +3489,7 @@
               <a:graphicData uri="http://schemas.openxmlformats.org/drawingml/2006/picture">
                 <pic:pic>
                   <pic:nvPicPr>
-                    <pic:cNvPr descr="W2_files/figure-docx/unnamed-chunk-23-1.png" id="57" name="Picture"/>
+                    <pic:cNvPr descr="W2_files/figure-docx/unnamed-chunk-24-1.png" id="57" name="Picture"/>
                     <pic:cNvPicPr>
                       <a:picLocks noChangeArrowheads="1" noChangeAspect="1"/>
                     </pic:cNvPicPr>
@@ -3947,7 +3990,7 @@
               <a:graphicData uri="http://schemas.openxmlformats.org/drawingml/2006/picture">
                 <pic:pic>
                   <pic:nvPicPr>
-                    <pic:cNvPr descr="W2_files/figure-docx/unnamed-chunk-24-1.png" id="60" name="Picture"/>
+                    <pic:cNvPr descr="W2_files/figure-docx/unnamed-chunk-25-1.png" id="60" name="Picture"/>
                     <pic:cNvPicPr>
                       <a:picLocks noChangeArrowheads="1" noChangeAspect="1"/>
                     </pic:cNvPicPr>
@@ -3993,7 +4036,7 @@
       <w:pPr>
         <w:numPr>
           <w:ilvl w:val="0"/>
-          <w:numId w:val="1007"/>
+          <w:numId w:val="1008"/>
         </w:numPr>
       </w:pPr>
       <w:r>
@@ -4004,7 +4047,7 @@
       <w:pPr>
         <w:numPr>
           <w:ilvl w:val="0"/>
-          <w:numId w:val="1007"/>
+          <w:numId w:val="1008"/>
         </w:numPr>
       </w:pPr>
       <w:r>
@@ -4015,7 +4058,7 @@
       <w:pPr>
         <w:numPr>
           <w:ilvl w:val="0"/>
-          <w:numId w:val="1007"/>
+          <w:numId w:val="1008"/>
         </w:numPr>
       </w:pPr>
       <w:r>
@@ -4169,7 +4212,7 @@
               <a:graphicData uri="http://schemas.openxmlformats.org/drawingml/2006/picture">
                 <pic:pic>
                   <pic:nvPicPr>
-                    <pic:cNvPr descr="W2_files/figure-docx/unnamed-chunk-28-1.png" id="66" name="Picture"/>
+                    <pic:cNvPr descr="W2_files/figure-docx/unnamed-chunk-29-1.png" id="66" name="Picture"/>
                     <pic:cNvPicPr>
                       <a:picLocks noChangeArrowheads="1" noChangeAspect="1"/>
                     </pic:cNvPicPr>
@@ -4411,7 +4454,7 @@
       <w:pPr>
         <w:numPr>
           <w:ilvl w:val="0"/>
-          <w:numId w:val="1008"/>
+          <w:numId w:val="1009"/>
         </w:numPr>
       </w:pPr>
       <w:r>
@@ -4431,7 +4474,7 @@
       <w:pPr>
         <w:numPr>
           <w:ilvl w:val="0"/>
-          <w:numId w:val="1008"/>
+          <w:numId w:val="1009"/>
         </w:numPr>
       </w:pPr>
       <w:r>
@@ -4451,7 +4494,7 @@
       <w:pPr>
         <w:numPr>
           <w:ilvl w:val="0"/>
-          <w:numId w:val="1008"/>
+          <w:numId w:val="1009"/>
         </w:numPr>
       </w:pPr>
       <w:r>
@@ -4471,7 +4514,7 @@
       <w:pPr>
         <w:numPr>
           <w:ilvl w:val="0"/>
-          <w:numId w:val="1008"/>
+          <w:numId w:val="1009"/>
         </w:numPr>
       </w:pPr>
       <w:r>
@@ -4491,7 +4534,7 @@
       <w:pPr>
         <w:numPr>
           <w:ilvl w:val="0"/>
-          <w:numId w:val="1008"/>
+          <w:numId w:val="1009"/>
         </w:numPr>
       </w:pPr>
       <w:r>
@@ -4511,7 +4554,7 @@
       <w:pPr>
         <w:numPr>
           <w:ilvl w:val="0"/>
-          <w:numId w:val="1008"/>
+          <w:numId w:val="1009"/>
         </w:numPr>
       </w:pPr>
       <w:r>
@@ -4531,7 +4574,7 @@
       <w:pPr>
         <w:numPr>
           <w:ilvl w:val="0"/>
-          <w:numId w:val="1008"/>
+          <w:numId w:val="1009"/>
         </w:numPr>
       </w:pPr>
       <w:r>
@@ -4551,7 +4594,7 @@
       <w:pPr>
         <w:numPr>
           <w:ilvl w:val="0"/>
-          <w:numId w:val="1008"/>
+          <w:numId w:val="1009"/>
         </w:numPr>
       </w:pPr>
       <w:r>
@@ -4587,7 +4630,7 @@
       <w:pPr>
         <w:numPr>
           <w:ilvl w:val="0"/>
-          <w:numId w:val="1008"/>
+          <w:numId w:val="1009"/>
         </w:numPr>
       </w:pPr>
       <w:r>
@@ -4607,7 +4650,7 @@
       <w:pPr>
         <w:numPr>
           <w:ilvl w:val="0"/>
-          <w:numId w:val="1008"/>
+          <w:numId w:val="1009"/>
         </w:numPr>
       </w:pPr>
       <w:r>
@@ -4627,7 +4670,7 @@
       <w:pPr>
         <w:numPr>
           <w:ilvl w:val="0"/>
-          <w:numId w:val="1008"/>
+          <w:numId w:val="1009"/>
         </w:numPr>
       </w:pPr>
       <w:r>
@@ -4680,7 +4723,7 @@
       <w:pPr>
         <w:numPr>
           <w:ilvl w:val="0"/>
-          <w:numId w:val="1008"/>
+          <w:numId w:val="1009"/>
         </w:numPr>
       </w:pPr>
       <w:r>
@@ -5725,6 +5768,91 @@
       </w:pPr>
     </w:lvl>
   </w:abstractNum>
+  <w:abstractNum w:abstractNumId="99414">
+    <w:nsid w:val="A99414"/>
+    <w:multiLevelType w:val="multilevel"/>
+    <w:lvl w:ilvl="0">
+      <w:start w:val="4"/>
+      <w:numFmt w:val="decimal"/>
+      <w:lvlText w:val="%1."/>
+      <w:lvlJc w:val="left"/>
+      <w:pPr>
+        <w:ind w:left="720" w:hanging="480"/>
+      </w:pPr>
+    </w:lvl>
+    <w:lvl w:ilvl="1">
+      <w:start w:val="4"/>
+      <w:numFmt w:val="decimal"/>
+      <w:lvlText w:val="%2."/>
+      <w:lvlJc w:val="left"/>
+      <w:pPr>
+        <w:ind w:left="1440" w:hanging="480"/>
+      </w:pPr>
+    </w:lvl>
+    <w:lvl w:ilvl="2">
+      <w:start w:val="4"/>
+      <w:numFmt w:val="decimal"/>
+      <w:lvlText w:val="%3."/>
+      <w:lvlJc w:val="left"/>
+      <w:pPr>
+        <w:ind w:left="2160" w:hanging="480"/>
+      </w:pPr>
+    </w:lvl>
+    <w:lvl w:ilvl="3">
+      <w:start w:val="4"/>
+      <w:numFmt w:val="decimal"/>
+      <w:lvlText w:val="%4."/>
+      <w:lvlJc w:val="left"/>
+      <w:pPr>
+        <w:ind w:left="2880" w:hanging="480"/>
+      </w:pPr>
+    </w:lvl>
+    <w:lvl w:ilvl="4">
+      <w:start w:val="4"/>
+      <w:numFmt w:val="decimal"/>
+      <w:lvlText w:val="%5."/>
+      <w:lvlJc w:val="left"/>
+      <w:pPr>
+        <w:ind w:left="3600" w:hanging="480"/>
+      </w:pPr>
+    </w:lvl>
+    <w:lvl w:ilvl="5">
+      <w:start w:val="4"/>
+      <w:numFmt w:val="decimal"/>
+      <w:lvlText w:val="%6."/>
+      <w:lvlJc w:val="left"/>
+      <w:pPr>
+        <w:ind w:left="4320" w:hanging="480"/>
+      </w:pPr>
+    </w:lvl>
+    <w:lvl w:ilvl="6">
+      <w:start w:val="4"/>
+      <w:numFmt w:val="decimal"/>
+      <w:lvlText w:val="%7."/>
+      <w:lvlJc w:val="left"/>
+      <w:pPr>
+        <w:ind w:left="5040" w:hanging="480"/>
+      </w:pPr>
+    </w:lvl>
+    <w:lvl w:ilvl="7">
+      <w:start w:val="4"/>
+      <w:numFmt w:val="decimal"/>
+      <w:lvlText w:val="%8."/>
+      <w:lvlJc w:val="left"/>
+      <w:pPr>
+        <w:ind w:left="5760" w:hanging="480"/>
+      </w:pPr>
+    </w:lvl>
+    <w:lvl w:ilvl="8">
+      <w:start w:val="4"/>
+      <w:numFmt w:val="decimal"/>
+      <w:lvlText w:val="%9."/>
+      <w:lvlJc w:val="left"/>
+      <w:pPr>
+        <w:ind w:left="6480" w:hanging="480"/>
+      </w:pPr>
+    </w:lvl>
+  </w:abstractNum>
   <w:num w16cid:durableId="1968661439" w:numId="1">
     <w:abstractNumId w:val="0"/>
   </w:num>
@@ -5945,6 +6073,36 @@
     </w:lvlOverride>
   </w:num>
   <w:num w:numId="1007">
+    <w:abstractNumId w:val="99414"/>
+    <w:lvlOverride w:ilvl="0">
+      <w:startOverride w:val="4"/>
+    </w:lvlOverride>
+    <w:lvlOverride w:ilvl="1">
+      <w:startOverride w:val="4"/>
+    </w:lvlOverride>
+    <w:lvlOverride w:ilvl="2">
+      <w:startOverride w:val="4"/>
+    </w:lvlOverride>
+    <w:lvlOverride w:ilvl="3">
+      <w:startOverride w:val="4"/>
+    </w:lvlOverride>
+    <w:lvlOverride w:ilvl="4">
+      <w:startOverride w:val="4"/>
+    </w:lvlOverride>
+    <w:lvlOverride w:ilvl="5">
+      <w:startOverride w:val="4"/>
+    </w:lvlOverride>
+    <w:lvlOverride w:ilvl="6">
+      <w:startOverride w:val="4"/>
+    </w:lvlOverride>
+    <w:lvlOverride w:ilvl="7">
+      <w:startOverride w:val="4"/>
+    </w:lvlOverride>
+    <w:lvlOverride w:ilvl="8">
+      <w:startOverride w:val="4"/>
+    </w:lvlOverride>
+  </w:num>
+  <w:num w:numId="1008">
     <w:abstractNumId w:val="99411"/>
     <w:lvlOverride w:ilvl="0">
       <w:startOverride w:val="1"/>
@@ -5974,7 +6132,7 @@
       <w:startOverride w:val="1"/>
     </w:lvlOverride>
   </w:num>
-  <w:num w:numId="1008">
+  <w:num w:numId="1009">
     <w:abstractNumId w:val="99411"/>
     <w:lvlOverride w:ilvl="0">
       <w:startOverride w:val="1"/>

</xml_diff>

<commit_message>
Updates to W2 with Michelle's comments.
</commit_message>
<xml_diff>
--- a/Workshops/Workshop 2 - Data vis/W2.docx
+++ b/Workshops/Workshop 2 - Data vis/W2.docx
@@ -71,7 +71,7 @@
         <w:t xml:space="preserve"> </w:t>
       </w:r>
       <w:r>
-        <w:t xml:space="preserve">2024-09-02</w:t>
+        <w:t xml:space="preserve">2024-09-05</w:t>
       </w:r>
     </w:p>
     <w:sdt>
@@ -717,7 +717,86 @@
         <w:t xml:space="preserve"> </w:t>
       </w:r>
       <w:r>
-        <w:t xml:space="preserve">clear. To begin with, we can simple make a</w:t>
+        <w:t xml:space="preserve">clear. But before we can do this, we first need to install the package (if you haven’t done so already) and then load it ready to use:</w:t>
+      </w:r>
+    </w:p>
+    <w:p>
+      <w:pPr>
+        <w:pStyle w:val="SourceCode"/>
+      </w:pPr>
+      <w:r>
+        <w:rPr>
+          <w:rStyle w:val="FunctionTok"/>
+        </w:rPr>
+        <w:t xml:space="preserve">install.packages</w:t>
+      </w:r>
+      <w:r>
+        <w:rPr>
+          <w:rStyle w:val="NormalTok"/>
+        </w:rPr>
+        <w:t xml:space="preserve">(</w:t>
+      </w:r>
+      <w:r>
+        <w:rPr>
+          <w:rStyle w:val="StringTok"/>
+        </w:rPr>
+        <w:t xml:space="preserve">"ggplot2"</w:t>
+      </w:r>
+      <w:r>
+        <w:rPr>
+          <w:rStyle w:val="NormalTok"/>
+        </w:rPr>
+        <w:t xml:space="preserve">) </w:t>
+      </w:r>
+      <w:r>
+        <w:rPr>
+          <w:rStyle w:val="CommentTok"/>
+        </w:rPr>
+        <w:t xml:space="preserve"># Install the software</w:t>
+      </w:r>
+      <w:r>
+        <w:br/>
+      </w:r>
+      <w:r>
+        <w:rPr>
+          <w:rStyle w:val="FunctionTok"/>
+        </w:rPr>
+        <w:t xml:space="preserve">library</w:t>
+      </w:r>
+      <w:r>
+        <w:rPr>
+          <w:rStyle w:val="NormalTok"/>
+        </w:rPr>
+        <w:t xml:space="preserve">(ggplot2) </w:t>
+      </w:r>
+      <w:r>
+        <w:rPr>
+          <w:rStyle w:val="CommentTok"/>
+        </w:rPr>
+        <w:t xml:space="preserve"># Load the software</w:t>
+      </w:r>
+    </w:p>
+    <w:p>
+      <w:pPr>
+        <w:pStyle w:val="FirstParagraph"/>
+      </w:pPr>
+      <w:r>
+        <w:t xml:space="preserve">Once we have</w:t>
+      </w:r>
+      <w:r>
+        <w:t xml:space="preserve"> </w:t>
+      </w:r>
+      <w:r>
+        <w:rPr>
+          <w:rStyle w:val="VerbatimChar"/>
+        </w:rPr>
+        <w:t xml:space="preserve">ggplot2</w:t>
+      </w:r>
+      <w:r>
+        <w:t xml:space="preserve"> </w:t>
+      </w:r>
+      <w:r>
+        <w:t xml:space="preserve">installed and loaded, we can make a simple</w:t>
       </w:r>
       <w:r>
         <w:t xml:space="preserve"> </w:t>
@@ -766,7 +845,7 @@
               <a:graphicData uri="http://schemas.openxmlformats.org/drawingml/2006/picture">
                 <pic:pic>
                   <pic:nvPicPr>
-                    <pic:cNvPr descr="W2_files/figure-docx/unnamed-chunk-5-1.png" id="26" name="Picture"/>
+                    <pic:cNvPr descr="W2_files/figure-docx/unnamed-chunk-6-1.png" id="26" name="Picture"/>
                     <pic:cNvPicPr>
                       <a:picLocks noChangeArrowheads="1" noChangeAspect="1"/>
                     </pic:cNvPicPr>
@@ -838,7 +917,7 @@
               <a:graphicData uri="http://schemas.openxmlformats.org/drawingml/2006/picture">
                 <pic:pic>
                   <pic:nvPicPr>
-                    <pic:cNvPr descr="W2_files/figure-docx/unnamed-chunk-6-1.png" id="29" name="Picture"/>
+                    <pic:cNvPr descr="W2_files/figure-docx/unnamed-chunk-7-1.png" id="29" name="Picture"/>
                     <pic:cNvPicPr>
                       <a:picLocks noChangeArrowheads="1" noChangeAspect="1"/>
                     </pic:cNvPicPr>
@@ -1086,7 +1165,7 @@
               <a:graphicData uri="http://schemas.openxmlformats.org/drawingml/2006/picture">
                 <pic:pic>
                   <pic:nvPicPr>
-                    <pic:cNvPr descr="W2_files/figure-docx/unnamed-chunk-7-1.png" id="32" name="Picture"/>
+                    <pic:cNvPr descr="W2_files/figure-docx/unnamed-chunk-8-1.png" id="32" name="Picture"/>
                     <pic:cNvPicPr>
                       <a:picLocks noChangeArrowheads="1" noChangeAspect="1"/>
                     </pic:cNvPicPr>
@@ -1347,7 +1426,7 @@
               <a:graphicData uri="http://schemas.openxmlformats.org/drawingml/2006/picture">
                 <pic:pic>
                   <pic:nvPicPr>
-                    <pic:cNvPr descr="W2_files/figure-docx/unnamed-chunk-12-1.png" id="37" name="Picture"/>
+                    <pic:cNvPr descr="W2_files/figure-docx/unnamed-chunk-13-1.png" id="37" name="Picture"/>
                     <pic:cNvPicPr>
                       <a:picLocks noChangeArrowheads="1" noChangeAspect="1"/>
                     </pic:cNvPicPr>
@@ -1415,7 +1494,7 @@
         <w:t xml:space="preserve"> </w:t>
       </w:r>
       <w:r>
-        <w:t xml:space="preserve">but also how the data is spread. There are two common options people use for this; boxplots and violin plots. It’s trivially easy to swap between these, because all we need to do is change the geometry function from</w:t>
+        <w:t xml:space="preserve">but also how the data is spread. There are two common options that people use for this; boxplots and violin plots. It’s trivially easy to swap between these, because all we need to do is change the geometry function from</w:t>
       </w:r>
       <w:r>
         <w:t xml:space="preserve"> </w:t>
@@ -1563,7 +1642,7 @@
               <a:graphicData uri="http://schemas.openxmlformats.org/drawingml/2006/picture">
                 <pic:pic>
                   <pic:nvPicPr>
-                    <pic:cNvPr descr="W2_files/figure-docx/unnamed-chunk-13-1.png" id="40" name="Picture"/>
+                    <pic:cNvPr descr="W2_files/figure-docx/unnamed-chunk-14-1.png" id="40" name="Picture"/>
                     <pic:cNvPicPr>
                       <a:picLocks noChangeArrowheads="1" noChangeAspect="1"/>
                     </pic:cNvPicPr>
@@ -1699,7 +1778,7 @@
               <a:graphicData uri="http://schemas.openxmlformats.org/drawingml/2006/picture">
                 <pic:pic>
                   <pic:nvPicPr>
-                    <pic:cNvPr descr="W2_files/figure-docx/unnamed-chunk-13-2.png" id="43" name="Picture"/>
+                    <pic:cNvPr descr="W2_files/figure-docx/unnamed-chunk-14-2.png" id="43" name="Picture"/>
                     <pic:cNvPicPr>
                       <a:picLocks noChangeArrowheads="1" noChangeAspect="1"/>
                     </pic:cNvPicPr>
@@ -1820,7 +1899,52 @@
         <w:t xml:space="preserve"> </w:t>
       </w:r>
       <w:r>
-        <w:t xml:space="preserve">should only be added to x and not y. Here’s how we do that:</w:t>
+        <w:t xml:space="preserve">should only be added to x and not y - which can can specify by saying</w:t>
+      </w:r>
+      <w:r>
+        <w:t xml:space="preserve"> </w:t>
+      </w:r>
+      <w:r>
+        <w:rPr>
+          <w:rStyle w:val="VerbatimChar"/>
+        </w:rPr>
+        <w:t xml:space="preserve">height = 0</w:t>
+      </w:r>
+      <w:r>
+        <w:t xml:space="preserve"> </w:t>
+      </w:r>
+      <w:r>
+        <w:t xml:space="preserve">(i.e. zero noise added to</w:t>
+      </w:r>
+      <w:r>
+        <w:t xml:space="preserve"> </w:t>
+      </w:r>
+      <w:r>
+        <w:t xml:space="preserve">“</w:t>
+      </w:r>
+      <w:r>
+        <w:t xml:space="preserve">height</w:t>
+      </w:r>
+      <w:r>
+        <w:t xml:space="preserve">”</w:t>
+      </w:r>
+      <w:r>
+        <w:t xml:space="preserve">, or the y-axis), and</w:t>
+      </w:r>
+      <w:r>
+        <w:t xml:space="preserve"> </w:t>
+      </w:r>
+      <w:r>
+        <w:rPr>
+          <w:rStyle w:val="VerbatimChar"/>
+        </w:rPr>
+        <w:t xml:space="preserve">width = 0.1</w:t>
+      </w:r>
+      <w:r>
+        <w:t xml:space="preserve"> </w:t>
+      </w:r>
+      <w:r>
+        <w:t xml:space="preserve">(i.e. points can move 0.1 units to the left and right on the x-axis). Here’s how we do that:</w:t>
       </w:r>
     </w:p>
     <w:p>
@@ -2028,7 +2152,7 @@
               <a:graphicData uri="http://schemas.openxmlformats.org/drawingml/2006/picture">
                 <pic:pic>
                   <pic:nvPicPr>
-                    <pic:cNvPr descr="W2_files/figure-docx/unnamed-chunk-14-1.png" id="46" name="Picture"/>
+                    <pic:cNvPr descr="W2_files/figure-docx/unnamed-chunk-15-1.png" id="46" name="Picture"/>
                     <pic:cNvPicPr>
                       <a:picLocks noChangeArrowheads="1" noChangeAspect="1"/>
                     </pic:cNvPicPr>
@@ -2836,7 +2960,7 @@
               <a:graphicData uri="http://schemas.openxmlformats.org/drawingml/2006/picture">
                 <pic:pic>
                   <pic:nvPicPr>
-                    <pic:cNvPr descr="W2_files/figure-docx/unnamed-chunk-22-1.png" id="51" name="Picture"/>
+                    <pic:cNvPr descr="W2_files/figure-docx/unnamed-chunk-23-1.png" id="51" name="Picture"/>
                     <pic:cNvPicPr>
                       <a:picLocks noChangeArrowheads="1" noChangeAspect="1"/>
                     </pic:cNvPicPr>
@@ -2874,7 +2998,7 @@
         <w:pStyle w:val="BodyText"/>
       </w:pPr>
       <w:r>
-        <w:t xml:space="preserve">With a really minor additional to the code, we now have points arbitrarily coloured red and blue for female and male. In doing so, we can see some evidence for sexual dimorphism but also that drought has a negative relationship for both species.</w:t>
+        <w:t xml:space="preserve">With a really minor additional to the code, we now have points arbitrarily coloured red and blue for female and male. In doing so, we can see some evidence for sexual dimorphism but also that drought has a negative relationship for both sexes.</w:t>
       </w:r>
     </w:p>
     <w:p>
@@ -3099,7 +3223,7 @@
               <a:graphicData uri="http://schemas.openxmlformats.org/drawingml/2006/picture">
                 <pic:pic>
                   <pic:nvPicPr>
-                    <pic:cNvPr descr="W2_files/figure-docx/unnamed-chunk-23-1.png" id="54" name="Picture"/>
+                    <pic:cNvPr descr="W2_files/figure-docx/unnamed-chunk-24-1.png" id="54" name="Picture"/>
                     <pic:cNvPicPr>
                       <a:picLocks noChangeArrowheads="1" noChangeAspect="1"/>
                     </pic:cNvPicPr>
@@ -3489,7 +3613,7 @@
               <a:graphicData uri="http://schemas.openxmlformats.org/drawingml/2006/picture">
                 <pic:pic>
                   <pic:nvPicPr>
-                    <pic:cNvPr descr="W2_files/figure-docx/unnamed-chunk-24-1.png" id="57" name="Picture"/>
+                    <pic:cNvPr descr="W2_files/figure-docx/unnamed-chunk-25-1.png" id="57" name="Picture"/>
                     <pic:cNvPicPr>
                       <a:picLocks noChangeArrowheads="1" noChangeAspect="1"/>
                     </pic:cNvPicPr>
@@ -3990,7 +4114,7 @@
               <a:graphicData uri="http://schemas.openxmlformats.org/drawingml/2006/picture">
                 <pic:pic>
                   <pic:nvPicPr>
-                    <pic:cNvPr descr="W2_files/figure-docx/unnamed-chunk-25-1.png" id="60" name="Picture"/>
+                    <pic:cNvPr descr="W2_files/figure-docx/unnamed-chunk-26-1.png" id="60" name="Picture"/>
                     <pic:cNvPicPr>
                       <a:picLocks noChangeArrowheads="1" noChangeAspect="1"/>
                     </pic:cNvPicPr>
@@ -4080,17 +4204,11 @@
     </w:p>
     <w:bookmarkEnd w:id="61"/>
     <w:bookmarkEnd w:id="62"/>
-    <w:bookmarkStart w:id="67" w:name="optional-geom_s"/>
+    <w:bookmarkStart w:id="64" w:name="geom_s"/>
     <w:p>
       <w:pPr>
         <w:pStyle w:val="Heading1"/>
       </w:pPr>
-      <w:r>
-        <w:t xml:space="preserve">Optional:</w:t>
-      </w:r>
-      <w:r>
-        <w:t xml:space="preserve"> </w:t>
-      </w:r>
       <w:r>
         <w:rPr>
           <w:rStyle w:val="VerbatimChar"/>
@@ -4195,159 +4313,17 @@
         <w:t xml:space="preserve"> </w:t>
       </w:r>
       <w:r>
-        <w:t xml:space="preserve">to use, you will be prompted to install a new package when you run the code (it’s fine to install this new package - simply type 1 and enter in the console to do so).</w:t>
-      </w:r>
-    </w:p>
-    <w:p>
-      <w:pPr>
-        <w:pStyle w:val="BodyText"/>
-      </w:pPr>
-      <w:r>
-        <w:drawing>
-          <wp:inline>
-            <wp:extent cx="4620126" cy="3696101"/>
-            <wp:effectExtent b="0" l="0" r="0" t="0"/>
-            <wp:docPr descr="" title="" id="65" name="Picture"/>
-            <a:graphic>
-              <a:graphicData uri="http://schemas.openxmlformats.org/drawingml/2006/picture">
-                <pic:pic>
-                  <pic:nvPicPr>
-                    <pic:cNvPr descr="W2_files/figure-docx/unnamed-chunk-29-1.png" id="66" name="Picture"/>
-                    <pic:cNvPicPr>
-                      <a:picLocks noChangeArrowheads="1" noChangeAspect="1"/>
-                    </pic:cNvPicPr>
-                  </pic:nvPicPr>
-                  <pic:blipFill>
-                    <a:blip r:embed="rId64"/>
-                    <a:stretch>
-                      <a:fillRect/>
-                    </a:stretch>
-                  </pic:blipFill>
-                  <pic:spPr bwMode="auto">
-                    <a:xfrm>
-                      <a:off x="0" y="0"/>
-                      <a:ext cx="4620126" cy="3696101"/>
-                    </a:xfrm>
-                    <a:prstGeom prst="rect">
-                      <a:avLst/>
-                    </a:prstGeom>
-                    <a:noFill/>
-                    <a:ln w="9525">
-                      <a:noFill/>
-                      <a:headEnd/>
-                      <a:tailEnd/>
-                    </a:ln>
-                  </pic:spPr>
-                </pic:pic>
-              </a:graphicData>
-            </a:graphic>
-          </wp:inline>
-        </w:drawing>
-      </w:r>
-    </w:p>
-    <w:bookmarkEnd w:id="67"/>
-    <w:bookmarkStart w:id="75" w:name="the-good-and-the-bad"/>
+        <w:t xml:space="preserve">to use, you will be prompted to install a new package when you run the code (it’s fine to install this new package - simply type 1 and enter in the console when prompted).</w:t>
+      </w:r>
+    </w:p>
+    <w:bookmarkEnd w:id="64"/>
+    <w:bookmarkStart w:id="68" w:name="the-good-and-the-bad"/>
     <w:p>
       <w:pPr>
         <w:pStyle w:val="Heading1"/>
       </w:pPr>
       <w:r>
         <w:t xml:space="preserve">The good and the bad</w:t>
-      </w:r>
-    </w:p>
-    <w:p>
-      <w:pPr>
-        <w:pStyle w:val="SourceCode"/>
-      </w:pPr>
-      <w:r>
-        <w:rPr>
-          <w:rStyle w:val="NormalTok"/>
-        </w:rPr>
-        <w:t xml:space="preserve">abdn </w:t>
-      </w:r>
-      <w:r>
-        <w:rPr>
-          <w:rStyle w:val="OtherTok"/>
-        </w:rPr>
-        <w:t xml:space="preserve">&lt;-</w:t>
-      </w:r>
-      <w:r>
-        <w:rPr>
-          <w:rStyle w:val="NormalTok"/>
-        </w:rPr>
-        <w:t xml:space="preserve"> </w:t>
-      </w:r>
-      <w:r>
-        <w:rPr>
-          <w:rStyle w:val="FunctionTok"/>
-        </w:rPr>
-        <w:t xml:space="preserve">read.csv</w:t>
-      </w:r>
-      <w:r>
-        <w:rPr>
-          <w:rStyle w:val="NormalTok"/>
-        </w:rPr>
-        <w:t xml:space="preserve">(</w:t>
-      </w:r>
-      <w:r>
-        <w:rPr>
-          <w:rStyle w:val="FunctionTok"/>
-        </w:rPr>
-        <w:t xml:space="preserve">here</w:t>
-      </w:r>
-      <w:r>
-        <w:rPr>
-          <w:rStyle w:val="NormalTok"/>
-        </w:rPr>
-        <w:t xml:space="preserve">(</w:t>
-      </w:r>
-      <w:r>
-        <w:rPr>
-          <w:rStyle w:val="StringTok"/>
-        </w:rPr>
-        <w:t xml:space="preserve">"Workshops/Workshop 2 - Data vis/Data"</w:t>
-      </w:r>
-      <w:r>
-        <w:rPr>
-          <w:rStyle w:val="NormalTok"/>
-        </w:rPr>
-        <w:t xml:space="preserve">, </w:t>
-      </w:r>
-      <w:r>
-        <w:rPr>
-          <w:rStyle w:val="StringTok"/>
-        </w:rPr>
-        <w:t xml:space="preserve">"abdn_flats.csv"</w:t>
-      </w:r>
-      <w:r>
-        <w:rPr>
-          <w:rStyle w:val="NormalTok"/>
-        </w:rPr>
-        <w:t xml:space="preserve">), </w:t>
-      </w:r>
-      <w:r>
-        <w:rPr>
-          <w:rStyle w:val="AttributeTok"/>
-        </w:rPr>
-        <w:t xml:space="preserve">header =</w:t>
-      </w:r>
-      <w:r>
-        <w:rPr>
-          <w:rStyle w:val="NormalTok"/>
-        </w:rPr>
-        <w:t xml:space="preserve"> </w:t>
-      </w:r>
-      <w:r>
-        <w:rPr>
-          <w:rStyle w:val="ConstantTok"/>
-        </w:rPr>
-        <w:t xml:space="preserve">TRUE</w:t>
-      </w:r>
-      <w:r>
-        <w:rPr>
-          <w:rStyle w:val="NormalTok"/>
-        </w:rPr>
-        <w:t xml:space="preserve">)</w:t>
       </w:r>
     </w:p>
     <w:p>
@@ -4818,7 +4794,7 @@
         <w:t xml:space="preserve">Once you’re happy you know the data relatively well, let’s get to the tasks.</w:t>
       </w:r>
     </w:p>
-    <w:bookmarkStart w:id="73" w:name="the-good"/>
+    <w:bookmarkStart w:id="66" w:name="the-good"/>
     <w:p>
       <w:pPr>
         <w:pStyle w:val="Heading2"/>
@@ -4874,62 +4850,7 @@
         <w:t xml:space="preserve"> </w:t>
       </w:r>
       <w:r>
-        <w:t xml:space="preserve">dataset. Curious how much you might get paid to do this?</w:t>
-      </w:r>
-    </w:p>
-    <w:p>
-      <w:pPr>
-        <w:pStyle w:val="CaptionedFigure"/>
-      </w:pPr>
-      <w:r>
-        <w:drawing>
-          <wp:inline>
-            <wp:extent cx="5943600" cy="3093288"/>
-            <wp:effectExtent b="0" l="0" r="0" t="0"/>
-            <wp:docPr descr="Look at that salary!" title="" id="69" name="Picture"/>
-            <a:graphic>
-              <a:graphicData uri="http://schemas.openxmlformats.org/drawingml/2006/picture">
-                <pic:pic>
-                  <pic:nvPicPr>
-                    <pic:cNvPr descr="H:/003%20-%20Teaching/006-BI3010/Workshops/Workshop%202%20-%20Data%20vis/athletics.PNG" id="70" name="Picture"/>
-                    <pic:cNvPicPr>
-                      <a:picLocks noChangeArrowheads="1" noChangeAspect="1"/>
-                    </pic:cNvPicPr>
-                  </pic:nvPicPr>
-                  <pic:blipFill>
-                    <a:blip r:embed="rId68"/>
-                    <a:stretch>
-                      <a:fillRect/>
-                    </a:stretch>
-                  </pic:blipFill>
-                  <pic:spPr bwMode="auto">
-                    <a:xfrm>
-                      <a:off x="0" y="0"/>
-                      <a:ext cx="5943600" cy="3093288"/>
-                    </a:xfrm>
-                    <a:prstGeom prst="rect">
-                      <a:avLst/>
-                    </a:prstGeom>
-                    <a:noFill/>
-                    <a:ln w="9525">
-                      <a:noFill/>
-                      <a:headEnd/>
-                      <a:tailEnd/>
-                    </a:ln>
-                  </pic:spPr>
-                </pic:pic>
-              </a:graphicData>
-            </a:graphic>
-          </wp:inline>
-        </w:drawing>
-      </w:r>
-    </w:p>
-    <w:p>
-      <w:pPr>
-        <w:pStyle w:val="ImageCaption"/>
-      </w:pPr>
-      <w:r>
-        <w:t xml:space="preserve">Look at that salary!</w:t>
+        <w:t xml:space="preserve">dataset.</w:t>
       </w:r>
     </w:p>
     <w:p>
@@ -4937,37 +4858,30 @@
         <w:pStyle w:val="BodyText"/>
       </w:pPr>
       <w:r>
-        <w:t xml:space="preserve">See</w:t>
-      </w:r>
-      <w:r>
-        <w:t xml:space="preserve"> </w:t>
-      </w:r>
-      <w:hyperlink r:id="rId71">
-        <w:r>
-          <w:rPr>
-            <w:rStyle w:val="Hyperlink"/>
-          </w:rPr>
-          <w:t xml:space="preserve">here</w:t>
-        </w:r>
-      </w:hyperlink>
-      <w:r>
-        <w:t xml:space="preserve"> </w:t>
-      </w:r>
-      <w:r>
-        <w:t xml:space="preserve">for the full job advert.</w:t>
-      </w:r>
-    </w:p>
-    <w:p>
-      <w:pPr>
-        <w:pStyle w:val="BodyText"/>
-      </w:pPr>
-      <w:r>
-        <w:t xml:space="preserve">Create your most informative and visually appealing figure now. Keep the lecture on effective communication in your mind, and avoid some of the pitfalls we discussed. If you need help figuring out how to implement one of your ideas, see</w:t>
-      </w:r>
-      <w:r>
-        <w:t xml:space="preserve"> </w:t>
-      </w:r>
-      <w:hyperlink r:id="rId72">
+        <w:t xml:space="preserve">Create your most informative and visually appealing figure now - note that your</w:t>
+      </w:r>
+      <w:r>
+        <w:t xml:space="preserve"> </w:t>
+      </w:r>
+      <w:r>
+        <w:t xml:space="preserve">“</w:t>
+      </w:r>
+      <w:r>
+        <w:t xml:space="preserve">audience</w:t>
+      </w:r>
+      <w:r>
+        <w:t xml:space="preserve">”</w:t>
+      </w:r>
+      <w:r>
+        <w:t xml:space="preserve"> </w:t>
+      </w:r>
+      <w:r>
+        <w:t xml:space="preserve">here are not scientists, they’re members of the public, so we want something that effectively communicates the information but is also eye catching. Keep the lecture on effective communication in your mind, and avoid some of the pitfalls we discussed. If you need help figuring out how to implement one of your ideas, see</w:t>
+      </w:r>
+      <w:r>
+        <w:t xml:space="preserve"> </w:t>
+      </w:r>
+      <w:hyperlink r:id="rId65">
         <w:r>
           <w:rPr>
             <w:rStyle w:val="Hyperlink"/>
@@ -5021,8 +4935,8 @@
         <w:t xml:space="preserve">, then go ahead by all means.</w:t>
       </w:r>
     </w:p>
-    <w:bookmarkEnd w:id="73"/>
-    <w:bookmarkStart w:id="74" w:name="the-bad"/>
+    <w:bookmarkEnd w:id="66"/>
+    <w:bookmarkStart w:id="67" w:name="the-bad"/>
     <w:p>
       <w:pPr>
         <w:pStyle w:val="Heading2"/>
@@ -5140,7 +5054,7 @@
         <w:pStyle w:val="BodyText"/>
       </w:pPr>
       <w:r>
-        <w:t xml:space="preserve">Once, you’re happy with your masterpieces, email you’re favourite the whomever is running your session (either Deon or Michelle), and we’ll have an</w:t>
+        <w:t xml:space="preserve">Once, you’re happy with your masterpieces, add your figures onto the MyAberdeen discussion board, and we’ll have an</w:t>
       </w:r>
       <w:r>
         <w:t xml:space="preserve"> </w:t>
@@ -5161,8 +5075,8 @@
         <w:t xml:space="preserve">to finish the workshop :D.</w:t>
       </w:r>
     </w:p>
-    <w:bookmarkEnd w:id="74"/>
-    <w:bookmarkEnd w:id="75"/>
+    <w:bookmarkEnd w:id="67"/>
+    <w:bookmarkEnd w:id="68"/>
     <w:sectPr>
       <w:pgSz w:h="15840" w:w="12240"/>
       <w:pgMar w:bottom="1440" w:footer="720" w:gutter="0" w:header="720" w:left="1440" w:right="1440" w:top="1440"/>

</xml_diff>

<commit_message>
Updates following Vicki comments
</commit_message>
<xml_diff>
--- a/Workshops/Workshop 2 - Data vis/W2.docx
+++ b/Workshops/Workshop 2 - Data vis/W2.docx
@@ -71,7 +71,7 @@
         <w:t xml:space="preserve"> </w:t>
       </w:r>
       <w:r>
-        <w:t xml:space="preserve">2024-09-05</w:t>
+        <w:t xml:space="preserve">2024-09-17</w:t>
       </w:r>
     </w:p>
     <w:sdt>
@@ -198,7 +198,7 @@
         <w:pStyle w:val="FirstParagraph"/>
       </w:pPr>
       <w:r>
-        <w:t xml:space="preserve">We covered steps 2 and 3 in the previous workshop but we’ll expand your toolkit for doing so today using data visualisation.</w:t>
+        <w:t xml:space="preserve">We covered steps 2 and 3 in the previous workshop, but we’ll expand your toolkit for doing so today using data visualisation.</w:t>
       </w:r>
     </w:p>
     <w:bookmarkEnd w:id="20"/>
@@ -351,7 +351,7 @@
         <w:t xml:space="preserve"> </w:t>
       </w:r>
       <w:r>
-        <w:t xml:space="preserve">is sometimes asked for by employers; we’ve even seen job adverts from companies such as Spotify listing this an an essential criteria.</w:t>
+        <w:t xml:space="preserve">is sometimes asked for by employers; we’ve even seen job adverts from companies such as Spotify listing this an an essential criterion.</w:t>
       </w:r>
     </w:p>
     <w:p>
@@ -430,7 +430,7 @@
         <w:pStyle w:val="FirstParagraph"/>
       </w:pPr>
       <w:r>
-        <w:t xml:space="preserve">For the first part of this workshop, we’ll be working with data on the Amazon river dolphin, or the boto (</w:t>
+        <w:t xml:space="preserve">For the first part of this workshop, we’ll be working with data on the Amazon River dolphin, or the boto (</w:t>
       </w:r>
       <w:r>
         <w:rPr>
@@ -443,7 +443,7 @@
         <w:t xml:space="preserve"> </w:t>
       </w:r>
       <w:r>
-        <w:t xml:space="preserve">- I wonder if the person who named the species had a friend called Geoff…). For this first interaction with this data we’ll broadly say that we’re interested in seeing if there is sexual dimorphism in asymptotic length (i.e. once an animal has stopped growing) between females and males, as well as how the species respond to droughts. As always, before we do any analysis, we need to ensure there is nothing</w:t>
+        <w:t xml:space="preserve">- I wonder if the person who named the species had a friend called Geoff…). For this first interaction with this data, we’ll broadly say that we’re interested in seeing if there is sexual dimorphism in asymptotic length (i.e. once an animal has stopped growing) between females and males, as well as how the species respond to droughts. As always, before we do any analysis, we need to ensure there is nothing</w:t>
       </w:r>
       <w:r>
         <w:t xml:space="preserve"> </w:t>
@@ -970,7 +970,7 @@
         <w:t xml:space="preserve"> </w:t>
       </w:r>
       <w:r>
-        <w:t xml:space="preserve">a couple of things. First, we need to say in what form we want to the data to be shown. Do we want points? Or lines? Or errorbars? Secondly, we need to say which specific data, or</w:t>
+        <w:t xml:space="preserve">a couple of things. First, we need to say in what form we want the data to be shown. Do we want points? Or lines? Or errorbars? Secondly, we need to say which specific data, or</w:t>
       </w:r>
       <w:r>
         <w:t xml:space="preserve"> </w:t>
@@ -1494,7 +1494,7 @@
         <w:t xml:space="preserve"> </w:t>
       </w:r>
       <w:r>
-        <w:t xml:space="preserve">but also how the data is spread. There are two common options that people use for this; boxplots and violin plots. It’s trivially easy to swap between these, because all we need to do is change the geometry function from</w:t>
+        <w:t xml:space="preserve">but also how the data is spread. There are two common options that people use for this: boxplots and violin plots. It’s trivially easy to swap between these, because all we need to do is change the geometry function from</w:t>
       </w:r>
       <w:r>
         <w:t xml:space="preserve"> </w:t>
@@ -1816,7 +1816,7 @@
         <w:pStyle w:val="BodyText"/>
       </w:pPr>
       <w:r>
-        <w:t xml:space="preserve">Both of these present the same information in different ways. The boxplot uses boxes and lines to indicate the range, the first and third quantiles and the median. Conversely, the violin plot also shows the spread of data but by creating density plots which are mirrored. Boxplots have a long history and use in science, but people are increasingly using violin plots, simply because they’re more transparent and clear than boxplots.</w:t>
+        <w:t xml:space="preserve">Both of these present the same information in different ways. The boxplot uses boxes and lines to indicate the range (the first and third quantiles) and the median. Conversely, the violin plot also shows the spread of data but by creating density plots which are mirrored. Boxplots have a long history and use in science, but people are increasingly using violin plots, simply because they’re more transparent and clearer than boxplots.</w:t>
       </w:r>
     </w:p>
     <w:p>
@@ -1824,7 +1824,7 @@
         <w:pStyle w:val="BodyText"/>
       </w:pPr>
       <w:r>
-        <w:t xml:space="preserve">With either boxplots and violin plots, it’s fairly common that people will add the data points to the figure as well - to really hammer home the spread of data. But we’ve seen before that using</w:t>
+        <w:t xml:space="preserve">With either boxplots or violin plots, it’s fairly common that people will add data points to the figure as well - to really hammer home the spread of data. But we’ve seen before that using</w:t>
       </w:r>
       <w:r>
         <w:t xml:space="preserve"> </w:t>
@@ -1839,7 +1839,15 @@
         <w:t xml:space="preserve"> </w:t>
       </w:r>
       <w:r>
-        <w:t xml:space="preserve">basically gives us a line of points that doesn’t help us understand the spread at all. An alternative is to use something called</w:t>
+        <w:t xml:space="preserve">basically gives us a line of points that doesn’t help us understand the spread at all.</w:t>
+      </w:r>
+    </w:p>
+    <w:p>
+      <w:pPr>
+        <w:pStyle w:val="BodyText"/>
+      </w:pPr>
+      <w:r>
+        <w:t xml:space="preserve">An alternative is to use something called</w:t>
       </w:r>
       <w:r>
         <w:t xml:space="preserve"> </w:t>
@@ -1866,7 +1874,15 @@
         <w:t xml:space="preserve">sex</w:t>
       </w:r>
       <w:r>
-        <w:t xml:space="preserve">). To do so, we can use</w:t>
+        <w:t xml:space="preserve">).</w:t>
+      </w:r>
+    </w:p>
+    <w:p>
+      <w:pPr>
+        <w:pStyle w:val="BodyText"/>
+      </w:pPr>
+      <w:r>
+        <w:t xml:space="preserve">To do so, we can use</w:t>
       </w:r>
       <w:r>
         <w:t xml:space="preserve"> </w:t>
@@ -2373,6 +2389,14 @@
     </w:p>
     <w:p>
       <w:pPr>
+        <w:pStyle w:val="FirstParagraph"/>
+      </w:pPr>
+      <w:r>
+        <w:t xml:space="preserve">The questions below have issues in the code which will either cause errors or will not do what ever was intended. To help with this, try to spot the error on your own first. If you’re really struggling, try running the code to see what happens.</w:t>
+      </w:r>
+    </w:p>
+    <w:p>
+      <w:pPr>
         <w:numPr>
           <w:ilvl w:val="0"/>
           <w:numId w:val="1004"/>
@@ -2704,7 +2728,37 @@
         <w:pStyle w:val="Compact"/>
       </w:pPr>
       <w:r>
-        <w:t xml:space="preserve">If I wanted to produce a histogram of boto lengths, what should my code look like?</w:t>
+        <w:t xml:space="preserve">If I wanted to produce a histogram of boto lengths, what should my code look like? (If you’re stuck, try typing</w:t>
+      </w:r>
+      <w:r>
+        <w:t xml:space="preserve"> </w:t>
+      </w:r>
+      <w:r>
+        <w:rPr>
+          <w:rStyle w:val="VerbatimChar"/>
+        </w:rPr>
+        <w:t xml:space="preserve">??geom_</w:t>
+      </w:r>
+      <w:r>
+        <w:t xml:space="preserve"> </w:t>
+      </w:r>
+      <w:r>
+        <w:t xml:space="preserve">into the console and scroll through the Help page, or type</w:t>
+      </w:r>
+      <w:r>
+        <w:t xml:space="preserve"> </w:t>
+      </w:r>
+      <w:r>
+        <w:rPr>
+          <w:rStyle w:val="VerbatimChar"/>
+        </w:rPr>
+        <w:t xml:space="preserve">geom_</w:t>
+      </w:r>
+      <w:r>
+        <w:t xml:space="preserve"> </w:t>
+      </w:r>
+      <w:r>
+        <w:t xml:space="preserve">into your script and wait for RStudio to give you a pop-up autocomplete prompt, or just do a quick google).</w:t>
       </w:r>
     </w:p>
     <w:bookmarkEnd w:id="47"/>
@@ -3261,7 +3315,7 @@
         <w:pStyle w:val="BodyText"/>
       </w:pPr>
       <w:r>
-        <w:t xml:space="preserve">Easy enough but the figure still looks kinda ugly. Let’s go about making it more visually appealing. A really easy way to do this is to use select on of many themes built into</w:t>
+        <w:t xml:space="preserve">Easy enough but the figure still looks kinda ugly. Let’s go about making it more visually appealing. A really easy way to do this is to use select one of many themes built into</w:t>
       </w:r>
       <w:r>
         <w:t xml:space="preserve"> </w:t>
@@ -3783,7 +3837,7 @@
         <w:t xml:space="preserve"> </w:t>
       </w:r>
       <w:r>
-        <w:t xml:space="preserve">then it’s like we’re saying</w:t>
+        <w:t xml:space="preserve">then it’s like we’re saying,</w:t>
       </w:r>
       <w:r>
         <w:t xml:space="preserve"> </w:t>
@@ -4204,7 +4258,7 @@
     </w:p>
     <w:bookmarkEnd w:id="61"/>
     <w:bookmarkEnd w:id="62"/>
-    <w:bookmarkStart w:id="64" w:name="geom_s"/>
+    <w:bookmarkStart w:id="67" w:name="geom_s"/>
     <w:p>
       <w:pPr>
         <w:pStyle w:val="Heading1"/>
@@ -4313,11 +4367,153 @@
         <w:t xml:space="preserve"> </w:t>
       </w:r>
       <w:r>
-        <w:t xml:space="preserve">to use, you will be prompted to install a new package when you run the code (it’s fine to install this new package - simply type 1 and enter in the console when prompted).</w:t>
-      </w:r>
-    </w:p>
-    <w:bookmarkEnd w:id="64"/>
-    <w:bookmarkStart w:id="68" w:name="the-good-and-the-bad"/>
+        <w:t xml:space="preserve">to use, you will be prompted to install a new package when you run the code (it’s fine to install this new package - simply type 1 and enter in the console when prompted) and you may be asked</w:t>
+      </w:r>
+      <w:r>
+        <w:t xml:space="preserve"> </w:t>
+      </w:r>
+      <w:r>
+        <w:t xml:space="preserve">“</w:t>
+      </w:r>
+      <w:r>
+        <w:t xml:space="preserve">Do you want to install from sources the package which needs compilation?</w:t>
+      </w:r>
+      <w:r>
+        <w:t xml:space="preserve">”</w:t>
+      </w:r>
+      <w:r>
+        <w:t xml:space="preserve">, if so just say no.</w:t>
+      </w:r>
+    </w:p>
+    <w:p>
+      <w:pPr>
+        <w:pStyle w:val="SourceCode"/>
+      </w:pPr>
+      <w:r>
+        <w:rPr>
+          <w:rStyle w:val="FunctionTok"/>
+        </w:rPr>
+        <w:t xml:space="preserve">ggplot</w:t>
+      </w:r>
+      <w:r>
+        <w:rPr>
+          <w:rStyle w:val="NormalTok"/>
+        </w:rPr>
+        <w:t xml:space="preserve">(boto) </w:t>
+      </w:r>
+      <w:r>
+        <w:rPr>
+          <w:rStyle w:val="SpecialCharTok"/>
+        </w:rPr>
+        <w:t xml:space="preserve">+</w:t>
+      </w:r>
+      <w:r>
+        <w:br/>
+      </w:r>
+      <w:r>
+        <w:rPr>
+          <w:rStyle w:val="NormalTok"/>
+        </w:rPr>
+        <w:t xml:space="preserve">  </w:t>
+      </w:r>
+      <w:r>
+        <w:rPr>
+          <w:rStyle w:val="FunctionTok"/>
+        </w:rPr>
+        <w:t xml:space="preserve">geom_hex</w:t>
+      </w:r>
+      <w:r>
+        <w:rPr>
+          <w:rStyle w:val="NormalTok"/>
+        </w:rPr>
+        <w:t xml:space="preserve">(</w:t>
+      </w:r>
+      <w:r>
+        <w:rPr>
+          <w:rStyle w:val="FunctionTok"/>
+        </w:rPr>
+        <w:t xml:space="preserve">aes</w:t>
+      </w:r>
+      <w:r>
+        <w:rPr>
+          <w:rStyle w:val="NormalTok"/>
+        </w:rPr>
+        <w:t xml:space="preserve">(</w:t>
+      </w:r>
+      <w:r>
+        <w:rPr>
+          <w:rStyle w:val="AttributeTok"/>
+        </w:rPr>
+        <w:t xml:space="preserve">x =</w:t>
+      </w:r>
+      <w:r>
+        <w:rPr>
+          <w:rStyle w:val="NormalTok"/>
+        </w:rPr>
+        <w:t xml:space="preserve"> drought, </w:t>
+      </w:r>
+      <w:r>
+        <w:rPr>
+          <w:rStyle w:val="AttributeTok"/>
+        </w:rPr>
+        <w:t xml:space="preserve">y =</w:t>
+      </w:r>
+      <w:r>
+        <w:rPr>
+          <w:rStyle w:val="NormalTok"/>
+        </w:rPr>
+        <w:t xml:space="preserve"> length))</w:t>
+      </w:r>
+    </w:p>
+    <w:p>
+      <w:pPr>
+        <w:pStyle w:val="FirstParagraph"/>
+      </w:pPr>
+      <w:r>
+        <w:drawing>
+          <wp:inline>
+            <wp:extent cx="4620126" cy="3696101"/>
+            <wp:effectExtent b="0" l="0" r="0" t="0"/>
+            <wp:docPr descr="" title="" id="65" name="Picture"/>
+            <a:graphic>
+              <a:graphicData uri="http://schemas.openxmlformats.org/drawingml/2006/picture">
+                <pic:pic>
+                  <pic:nvPicPr>
+                    <pic:cNvPr descr="W2_files/figure-docx/unnamed-chunk-30-1.png" id="66" name="Picture"/>
+                    <pic:cNvPicPr>
+                      <a:picLocks noChangeArrowheads="1" noChangeAspect="1"/>
+                    </pic:cNvPicPr>
+                  </pic:nvPicPr>
+                  <pic:blipFill>
+                    <a:blip r:embed="rId64"/>
+                    <a:stretch>
+                      <a:fillRect/>
+                    </a:stretch>
+                  </pic:blipFill>
+                  <pic:spPr bwMode="auto">
+                    <a:xfrm>
+                      <a:off x="0" y="0"/>
+                      <a:ext cx="4620126" cy="3696101"/>
+                    </a:xfrm>
+                    <a:prstGeom prst="rect">
+                      <a:avLst/>
+                    </a:prstGeom>
+                    <a:noFill/>
+                    <a:ln w="9525">
+                      <a:noFill/>
+                      <a:headEnd/>
+                      <a:tailEnd/>
+                    </a:ln>
+                  </pic:spPr>
+                </pic:pic>
+              </a:graphicData>
+            </a:graphic>
+          </wp:inline>
+        </w:drawing>
+      </w:r>
+    </w:p>
+    <w:bookmarkEnd w:id="67"/>
+    <w:bookmarkStart w:id="71" w:name="the-good-and-the-bad"/>
     <w:p>
       <w:pPr>
         <w:pStyle w:val="Heading1"/>
@@ -4423,7 +4619,7 @@
         <w:t xml:space="preserve"> </w:t>
       </w:r>
       <w:r>
-        <w:t xml:space="preserve">records (i.e. observations or samples) of rent prices for properties listed in Aberdeenshire on the ASPC website. In additional to the rent, 11 additional variables were recorded as well. These variables are:</w:t>
+        <w:t xml:space="preserve">records (i.e. observations or samples) of rent prices for properties listed in Aberdeenshire on the ASPC website. In addition to the rent price, 11 additional variables were recorded as well. The variables are:</w:t>
       </w:r>
     </w:p>
     <w:p>
@@ -4523,7 +4719,24 @@
         <w:t xml:space="preserve"> </w:t>
       </w:r>
       <w:r>
-        <w:t xml:space="preserve">- the total floor area of the property (measured in m^2)</w:t>
+        <w:t xml:space="preserve">- the total floor area of the property (measured in m</w:t>
+      </w:r>
+      <m:oMath>
+        <m:sSup>
+          <m:e>
+            <m:r>
+              <m:t>​</m:t>
+            </m:r>
+          </m:e>
+          <m:sup>
+            <m:r>
+              <m:t>2</m:t>
+            </m:r>
+          </m:sup>
+        </m:sSup>
+      </m:oMath>
+      <w:r>
+        <w:t xml:space="preserve">)</w:t>
       </w:r>
     </w:p>
     <w:p>
@@ -4794,7 +5007,7 @@
         <w:t xml:space="preserve">Once you’re happy you know the data relatively well, let’s get to the tasks.</w:t>
       </w:r>
     </w:p>
-    <w:bookmarkStart w:id="66" w:name="the-good"/>
+    <w:bookmarkStart w:id="69" w:name="the-good"/>
     <w:p>
       <w:pPr>
         <w:pStyle w:val="Heading2"/>
@@ -4876,12 +5089,12 @@
         <w:t xml:space="preserve"> </w:t>
       </w:r>
       <w:r>
-        <w:t xml:space="preserve">here are not scientists, they’re members of the public, so we want something that effectively communicates the information but is also eye catching. Keep the lecture on effective communication in your mind, and avoid some of the pitfalls we discussed. If you need help figuring out how to implement one of your ideas, see</w:t>
-      </w:r>
-      <w:r>
-        <w:t xml:space="preserve"> </w:t>
-      </w:r>
-      <w:hyperlink r:id="rId65">
+        <w:t xml:space="preserve">here are not scientists, they’re members of the public, so we want something that effectively communicates the information but is also eye catching. Keep the lecture on effective communication in your mind and avoid some of the pitfalls we discussed. If you need help figuring out how to implement one of your ideas, see</w:t>
+      </w:r>
+      <w:r>
+        <w:t xml:space="preserve"> </w:t>
+      </w:r>
+      <w:hyperlink r:id="rId68">
         <w:r>
           <w:rPr>
             <w:rStyle w:val="Hyperlink"/>
@@ -4893,7 +5106,19 @@
         <w:t xml:space="preserve"> </w:t>
       </w:r>
       <w:r>
-        <w:t xml:space="preserve">for a more detailed walk through, or else use your LLM or choice to help. If using an LLM, just remember to mention that you are using</w:t>
+        <w:t xml:space="preserve">for a slightly more detailed walk through on</w:t>
+      </w:r>
+      <w:r>
+        <w:t xml:space="preserve"> </w:t>
+      </w:r>
+      <w:r>
+        <w:rPr>
+          <w:rStyle w:val="VerbatimChar"/>
+        </w:rPr>
+        <w:t xml:space="preserve">ggplot2</w:t>
+      </w:r>
+      <w:r>
+        <w:t xml:space="preserve">, or else use your LLM of choice to help. If using an LLM, just remember to mention that you are using</w:t>
       </w:r>
       <w:r>
         <w:t xml:space="preserve"> </w:t>
@@ -4935,8 +5160,8 @@
         <w:t xml:space="preserve">, then go ahead by all means.</w:t>
       </w:r>
     </w:p>
-    <w:bookmarkEnd w:id="66"/>
-    <w:bookmarkStart w:id="67" w:name="the-bad"/>
+    <w:bookmarkEnd w:id="69"/>
+    <w:bookmarkStart w:id="70" w:name="the-bad"/>
     <w:p>
       <w:pPr>
         <w:pStyle w:val="Heading2"/>
@@ -5054,7 +5279,7 @@
         <w:pStyle w:val="BodyText"/>
       </w:pPr>
       <w:r>
-        <w:t xml:space="preserve">Once, you’re happy with your masterpieces, add your figures onto the MyAberdeen discussion board, and we’ll have an</w:t>
+        <w:t xml:space="preserve">Once you’re happy with your masterpieces, add your figures onto the MyAberdeen discussion board, and we’ll have an</w:t>
       </w:r>
       <w:r>
         <w:t xml:space="preserve"> </w:t>
@@ -5075,8 +5300,8 @@
         <w:t xml:space="preserve">to finish the workshop :D.</w:t>
       </w:r>
     </w:p>
-    <w:bookmarkEnd w:id="67"/>
-    <w:bookmarkEnd w:id="68"/>
+    <w:bookmarkEnd w:id="70"/>
+    <w:bookmarkEnd w:id="71"/>
     <w:sectPr>
       <w:pgSz w:h="15840" w:w="12240"/>
       <w:pgMar w:bottom="1440" w:footer="720" w:gutter="0" w:header="720" w:left="1440" w:right="1440" w:top="1440"/>

</xml_diff>